<commit_message>
Clarify API 650 is a tank construction standard utilizing ASTM materials rather than API X65 pipe grade
</commit_message>
<xml_diff>
--- a/20261021_0909_price_steel/20261021_0909_Price_Steel_Audio_Report.docx
+++ b/20261021_0909_price_steel/20261021_0909_Price_Steel_Audio_Report.docx
@@ -543,7 +543,7 @@
           <w:sz w:val="21"/>
           <w:szCs w:val="21"/>
         </w:rPr>
-        <w:t xml:space="preserve">客戶核心要求</w:t>
+        <w:t xml:space="preserve">規範本質釐清（API 650 施工規範 vs. API X65 管線鋼）</w:t>
       </w:r>
       <w:r>
         <w:rPr>
@@ -552,7 +552,7 @@
           <w:sz w:val="21"/>
           <w:szCs w:val="21"/>
         </w:rPr>
-        <w:t xml:space="preserve">：Price Steel 要求在既有結構鋼板上納入常壓儲油槽建造規範 </w:t>
+        <w:t xml:space="preserve">：會中我方初期一度誤以為客戶詢問的是 </w:t>
       </w:r>
       <w:r>
         <w:rPr>
@@ -563,7 +563,7 @@
           <w:sz w:val="21"/>
           <w:szCs w:val="21"/>
         </w:rPr>
-        <w:t xml:space="preserve">API 650 Class 3</w:t>
+        <w:t xml:space="preserve">API 5L X65</w:t>
       </w:r>
       <w:r>
         <w:rPr>
@@ -572,7 +572,7 @@
           <w:sz w:val="21"/>
           <w:szCs w:val="21"/>
         </w:rPr>
-        <w:t xml:space="preserve">，組成四合一多重規格（</w:t>
+        <w:t xml:space="preserve"> 管線鋼材料，後經現場釐清：</w:t>
       </w:r>
       <w:r>
         <w:rPr>
@@ -583,7 +583,7 @@
           <w:sz w:val="21"/>
           <w:szCs w:val="21"/>
         </w:rPr>
-        <w:t xml:space="preserve">CSA G40.21 38W / 44W + ASTM A36 + ASME SA36 + API 650 Class 3</w:t>
+        <w:t xml:space="preserve">API 650 實為常壓儲油槽之「施工建造規範（Construction / Fabrication Standard）」，其規範內允許使用的鋼板材料多為既有的 ASTM 規格（如 ASTM A36、A516 等）或加拿大 CSA G40.21 規格（38W / 44W）</w:t>
       </w:r>
       <w:r>
         <w:rPr>
@@ -592,7 +592,7 @@
           <w:sz w:val="21"/>
           <w:szCs w:val="21"/>
         </w:rPr>
-        <w:t xml:space="preserve">），使單一庫存即可通吃結構與大型儲槽工程。</w:t>
+        <w:t xml:space="preserve">，而非全新的煉鋼材料規格。</w:t>
       </w:r>
     </w:p>
     <w:p>
@@ -619,7 +619,7 @@
           <w:sz w:val="21"/>
           <w:szCs w:val="21"/>
         </w:rPr>
-        <w:t xml:space="preserve">MTR 標示與鋼板噴印底線</w:t>
+        <w:t xml:space="preserve">客戶核心要求</w:t>
       </w:r>
       <w:r>
         <w:rPr>
@@ -628,7 +628,7 @@
           <w:sz w:val="21"/>
           <w:szCs w:val="21"/>
         </w:rPr>
-        <w:t xml:space="preserve">：客戶拒絕單獨開立「符合性聲明書（Letter of Compliance）」，堅持必須</w:t>
+        <w:t xml:space="preserve">：Price Steel 要求在既有結構鋼板上納入 </w:t>
       </w:r>
       <w:r>
         <w:rPr>
@@ -639,7 +639,7 @@
           <w:sz w:val="21"/>
           <w:szCs w:val="21"/>
         </w:rPr>
-        <w:t xml:space="preserve">直接印在 MTR 材質證明書上</w:t>
+        <w:t xml:space="preserve">API 650 Class 3</w:t>
       </w:r>
       <w:r>
         <w:rPr>
@@ -648,7 +648,7 @@
           <w:sz w:val="21"/>
           <w:szCs w:val="21"/>
         </w:rPr>
-        <w:t xml:space="preserve">（可參考韓國東國製鋼 Dongkuk 標註 This steel is compliant with API 650 Class 3 以規避下游焊接施工之產品責任）並</w:t>
+        <w:t xml:space="preserve">，組成四合一多重規格（</w:t>
       </w:r>
       <w:r>
         <w:rPr>
@@ -659,7 +659,7 @@
           <w:sz w:val="21"/>
           <w:szCs w:val="21"/>
         </w:rPr>
-        <w:t xml:space="preserve">噴印（Stencil）於鋼板</w:t>
+        <w:t xml:space="preserve">CSA G40.21 38W / 44W + ASTM A36 + ASME SA36 + API 650 Class 3</w:t>
       </w:r>
       <w:r>
         <w:rPr>
@@ -668,67 +668,7 @@
           <w:sz w:val="21"/>
           <w:szCs w:val="21"/>
         </w:rPr>
-        <w:t xml:space="preserve">。目前韓國 </w:t>
-      </w:r>
-      <w:r>
-        <w:rPr>
-          <w:rFonts w:ascii="Calibri" w:hAnsi="Calibri" w:eastAsia="Microsoft JhengHei" w:cs="Calibri"/>
-          <w:b/>
-          <w:bCs/>
-          <w:color w:val="334155"/>
-          <w:sz w:val="21"/>
-          <w:szCs w:val="21"/>
-        </w:rPr>
-        <w:t xml:space="preserve">Hyundai</w:t>
-      </w:r>
-      <w:r>
-        <w:rPr>
-          <w:rFonts w:ascii="Calibri" w:hAnsi="Calibri" w:eastAsia="Microsoft JhengHei" w:cs="Calibri"/>
-          <w:color w:val="334155"/>
-          <w:sz w:val="21"/>
-          <w:szCs w:val="21"/>
-        </w:rPr>
-        <w:t xml:space="preserve">、加拿大 </w:t>
-      </w:r>
-      <w:r>
-        <w:rPr>
-          <w:rFonts w:ascii="Calibri" w:hAnsi="Calibri" w:eastAsia="Microsoft JhengHei" w:cs="Calibri"/>
-          <w:b/>
-          <w:bCs/>
-          <w:color w:val="334155"/>
-          <w:sz w:val="21"/>
-          <w:szCs w:val="21"/>
-        </w:rPr>
-        <w:t xml:space="preserve">Algoma</w:t>
-      </w:r>
-      <w:r>
-        <w:rPr>
-          <w:rFonts w:ascii="Calibri" w:hAnsi="Calibri" w:eastAsia="Microsoft JhengHei" w:cs="Calibri"/>
-          <w:color w:val="334155"/>
-          <w:sz w:val="21"/>
-          <w:szCs w:val="21"/>
-        </w:rPr>
-        <w:t xml:space="preserve"> 與美國 </w:t>
-      </w:r>
-      <w:r>
-        <w:rPr>
-          <w:rFonts w:ascii="Calibri" w:hAnsi="Calibri" w:eastAsia="Microsoft JhengHei" w:cs="Calibri"/>
-          <w:b/>
-          <w:bCs/>
-          <w:color w:val="334155"/>
-          <w:sz w:val="21"/>
-          <w:szCs w:val="21"/>
-        </w:rPr>
-        <w:t xml:space="preserve">Oregon Steel</w:t>
-      </w:r>
-      <w:r>
-        <w:rPr>
-          <w:rFonts w:ascii="Calibri" w:hAnsi="Calibri" w:eastAsia="Microsoft JhengHei" w:cs="Calibri"/>
-          <w:color w:val="334155"/>
-          <w:sz w:val="21"/>
-          <w:szCs w:val="21"/>
-        </w:rPr>
-        <w:t xml:space="preserve"> 皆免費提供此多重認證不加價。</w:t>
+        <w:t xml:space="preserve">），使單一庫存即可通吃結構與大型儲槽工程。</w:t>
       </w:r>
     </w:p>
     <w:p>
@@ -755,7 +695,7 @@
           <w:sz w:val="21"/>
           <w:szCs w:val="21"/>
         </w:rPr>
-        <w:t xml:space="preserve">30,000 噸儲槽市場與「Pacific Link」新油管商機</w:t>
+        <w:t xml:space="preserve">MTR 標示與鋼板噴印底線</w:t>
       </w:r>
       <w:r>
         <w:rPr>
@@ -764,7 +704,7 @@
           <w:sz w:val="21"/>
           <w:szCs w:val="21"/>
         </w:rPr>
-        <w:t xml:space="preserve">：加西常壓儲油槽鋼板年需求至少 </w:t>
+        <w:t xml:space="preserve">：客戶拒絕單獨開立「符合性聲明書（Letter of Compliance）」，堅持必須</w:t>
       </w:r>
       <w:r>
         <w:rPr>
@@ -775,7 +715,7 @@
           <w:sz w:val="21"/>
           <w:szCs w:val="21"/>
         </w:rPr>
-        <w:t xml:space="preserve">30,000 噸</w:t>
+        <w:t xml:space="preserve">直接印在 MTR 材質證明書上</w:t>
       </w:r>
       <w:r>
         <w:rPr>
@@ -784,7 +724,7 @@
           <w:sz w:val="21"/>
           <w:szCs w:val="21"/>
         </w:rPr>
-        <w:t xml:space="preserve">；且加拿大聯邦與亞伯達省已快速審批通過（fast-tracked）通往溫哥華的 </w:t>
+        <w:t xml:space="preserve">（可參考韓國東國製鋼 Dongkuk 標註 This steel is compliant with API 650 Class 3 以規避下游焊接施工之產品責任）並</w:t>
       </w:r>
       <w:r>
         <w:rPr>
@@ -795,7 +735,7 @@
           <w:sz w:val="21"/>
           <w:szCs w:val="21"/>
         </w:rPr>
-        <w:t xml:space="preserve">1,500 公里「Pacific Link」新輸油管線</w:t>
+        <w:t xml:space="preserve">噴印（Stencil）於鋼板</w:t>
       </w:r>
       <w:r>
         <w:rPr>
@@ -804,7 +744,67 @@
           <w:sz w:val="21"/>
           <w:szCs w:val="21"/>
         </w:rPr>
-        <w:t xml:space="preserve">（預計 2030 年代投產，轉銷台日韓），加上本拿比（Burnaby）儲槽區擴建，將引爆龐大常壓儲槽用板需求。</w:t>
+        <w:t xml:space="preserve">。目前韓國 </w:t>
+      </w:r>
+      <w:r>
+        <w:rPr>
+          <w:rFonts w:ascii="Calibri" w:hAnsi="Calibri" w:eastAsia="Microsoft JhengHei" w:cs="Calibri"/>
+          <w:b/>
+          <w:bCs/>
+          <w:color w:val="334155"/>
+          <w:sz w:val="21"/>
+          <w:szCs w:val="21"/>
+        </w:rPr>
+        <w:t xml:space="preserve">Hyundai</w:t>
+      </w:r>
+      <w:r>
+        <w:rPr>
+          <w:rFonts w:ascii="Calibri" w:hAnsi="Calibri" w:eastAsia="Microsoft JhengHei" w:cs="Calibri"/>
+          <w:color w:val="334155"/>
+          <w:sz w:val="21"/>
+          <w:szCs w:val="21"/>
+        </w:rPr>
+        <w:t xml:space="preserve">、加拿大 </w:t>
+      </w:r>
+      <w:r>
+        <w:rPr>
+          <w:rFonts w:ascii="Calibri" w:hAnsi="Calibri" w:eastAsia="Microsoft JhengHei" w:cs="Calibri"/>
+          <w:b/>
+          <w:bCs/>
+          <w:color w:val="334155"/>
+          <w:sz w:val="21"/>
+          <w:szCs w:val="21"/>
+        </w:rPr>
+        <w:t xml:space="preserve">Algoma</w:t>
+      </w:r>
+      <w:r>
+        <w:rPr>
+          <w:rFonts w:ascii="Calibri" w:hAnsi="Calibri" w:eastAsia="Microsoft JhengHei" w:cs="Calibri"/>
+          <w:color w:val="334155"/>
+          <w:sz w:val="21"/>
+          <w:szCs w:val="21"/>
+        </w:rPr>
+        <w:t xml:space="preserve"> 與美國 </w:t>
+      </w:r>
+      <w:r>
+        <w:rPr>
+          <w:rFonts w:ascii="Calibri" w:hAnsi="Calibri" w:eastAsia="Microsoft JhengHei" w:cs="Calibri"/>
+          <w:b/>
+          <w:bCs/>
+          <w:color w:val="334155"/>
+          <w:sz w:val="21"/>
+          <w:szCs w:val="21"/>
+        </w:rPr>
+        <w:t xml:space="preserve">Oregon Steel</w:t>
+      </w:r>
+      <w:r>
+        <w:rPr>
+          <w:rFonts w:ascii="Calibri" w:hAnsi="Calibri" w:eastAsia="Microsoft JhengHei" w:cs="Calibri"/>
+          <w:color w:val="334155"/>
+          <w:sz w:val="21"/>
+          <w:szCs w:val="21"/>
+        </w:rPr>
+        <w:t xml:space="preserve"> 皆免費提供此多重認證不加價。</w:t>
       </w:r>
     </w:p>
     <w:p>
@@ -821,6 +821,82 @@
           <w:szCs w:val="21"/>
         </w:rPr>
         <w:t xml:space="preserve">4. </w:t>
+      </w:r>
+      <w:r>
+        <w:rPr>
+          <w:rFonts w:ascii="Calibri" w:hAnsi="Calibri" w:eastAsia="Microsoft JhengHei" w:cs="Calibri"/>
+          <w:b/>
+          <w:bCs/>
+          <w:color w:val="334155"/>
+          <w:sz w:val="21"/>
+          <w:szCs w:val="21"/>
+        </w:rPr>
+        <w:t xml:space="preserve">30,000 噸儲槽市場與「Pacific Link」新油管商機</w:t>
+      </w:r>
+      <w:r>
+        <w:rPr>
+          <w:rFonts w:ascii="Calibri" w:hAnsi="Calibri" w:eastAsia="Microsoft JhengHei" w:cs="Calibri"/>
+          <w:color w:val="334155"/>
+          <w:sz w:val="21"/>
+          <w:szCs w:val="21"/>
+        </w:rPr>
+        <w:t xml:space="preserve">：加西常壓儲油槽鋼板年需求至少 </w:t>
+      </w:r>
+      <w:r>
+        <w:rPr>
+          <w:rFonts w:ascii="Calibri" w:hAnsi="Calibri" w:eastAsia="Microsoft JhengHei" w:cs="Calibri"/>
+          <w:b/>
+          <w:bCs/>
+          <w:color w:val="334155"/>
+          <w:sz w:val="21"/>
+          <w:szCs w:val="21"/>
+        </w:rPr>
+        <w:t xml:space="preserve">30,000 噸</w:t>
+      </w:r>
+      <w:r>
+        <w:rPr>
+          <w:rFonts w:ascii="Calibri" w:hAnsi="Calibri" w:eastAsia="Microsoft JhengHei" w:cs="Calibri"/>
+          <w:color w:val="334155"/>
+          <w:sz w:val="21"/>
+          <w:szCs w:val="21"/>
+        </w:rPr>
+        <w:t xml:space="preserve">；且加拿大聯邦與亞伯達省已快速審批通過（fast-tracked）通往溫哥華的 </w:t>
+      </w:r>
+      <w:r>
+        <w:rPr>
+          <w:rFonts w:ascii="Calibri" w:hAnsi="Calibri" w:eastAsia="Microsoft JhengHei" w:cs="Calibri"/>
+          <w:b/>
+          <w:bCs/>
+          <w:color w:val="334155"/>
+          <w:sz w:val="21"/>
+          <w:szCs w:val="21"/>
+        </w:rPr>
+        <w:t xml:space="preserve">1,500 公里「Pacific Link」新輸油管線</w:t>
+      </w:r>
+      <w:r>
+        <w:rPr>
+          <w:rFonts w:ascii="Calibri" w:hAnsi="Calibri" w:eastAsia="Microsoft JhengHei" w:cs="Calibri"/>
+          <w:color w:val="334155"/>
+          <w:sz w:val="21"/>
+          <w:szCs w:val="21"/>
+        </w:rPr>
+        <w:t xml:space="preserve">（預計 2030 年代投產，轉銷台日韓），加上本拿比（Burnaby）儲槽區擴建，將引爆龐大常壓儲槽用板需求。</w:t>
+      </w:r>
+    </w:p>
+    <w:p>
+      <w:pPr>
+        <w:spacing w:before="60" w:after="60" w:line="320" w:lineRule="auto"/>
+        <w:ind w:left="360"/>
+        <w:shd w:val="clear" w:color="auto" w:fill="F8FAFC"/>
+      </w:pPr>
+      <w:r>
+        <w:rPr>
+          <w:rFonts w:ascii="Calibri" w:hAnsi="Calibri" w:eastAsia="Microsoft JhengHei" w:cs="Calibri"/>
+          <w:color w:val="334155"/>
+          <w:sz w:val="21"/>
+          <w:szCs w:val="21"/>
+        </w:rPr>
+        <w:t xml:space="preserve">5. </w:t>
       </w:r>
       <w:r>
         <w:rPr>
@@ -2923,7 +2999,7 @@
           <w:sz w:val="21"/>
           <w:szCs w:val="21"/>
         </w:rPr>
-        <w:t xml:space="preserve">Delphic 的回應與澄清</w:t>
+        <w:t xml:space="preserve">Delphic 的回應與規範本質釐清（API X65 管線鋼 vs. API 650 儲槽施工規範）</w:t>
       </w:r>
       <w:r>
         <w:rPr>
@@ -2947,7 +3023,7 @@
           <w:sz w:val="21"/>
           <w:szCs w:val="21"/>
         </w:rPr>
-        <w:t xml:space="preserve">• Delphic 表示他記得中鋼曾開發過 </w:t>
+        <w:t xml:space="preserve">• Delphic 當下誤以為客戶詢問的是 API 管線鋼，表示記得中鋼曾開發過 </w:t>
       </w:r>
       <w:r>
         <w:rPr>
@@ -2967,7 +3043,7 @@
           <w:sz w:val="21"/>
           <w:szCs w:val="21"/>
         </w:rPr>
-        <w:t xml:space="preserve">（管線鋼）。</w:t>
+        <w:t xml:space="preserve">（API 5L 管線鋼）。</w:t>
       </w:r>
     </w:p>
     <w:p>
@@ -3013,16 +3089,36 @@
           <w:sz w:val="21"/>
           <w:szCs w:val="21"/>
         </w:rPr>
-        <w:t xml:space="preserve">API 650 Class 3 是用來製造大型儲油槽的鋼板規範（plate grade for manufacturing tanks）</w:t>
-      </w:r>
-      <w:r>
-        <w:rPr>
-          <w:rFonts w:ascii="Calibri" w:hAnsi="Calibri" w:eastAsia="Microsoft JhengHei" w:cs="Calibri"/>
-          <w:color w:val="1E293B"/>
-          <w:sz w:val="21"/>
-          <w:szCs w:val="21"/>
-        </w:rPr>
-        <w:t xml:space="preserve">。</w:t>
+        <w:t xml:space="preserve">API 650 是大型常壓儲油槽的「施工與建造規範（tank construction / fabrication specification）」</w:t>
+      </w:r>
+      <w:r>
+        <w:rPr>
+          <w:rFonts w:ascii="Calibri" w:hAnsi="Calibri" w:eastAsia="Microsoft JhengHei" w:cs="Calibri"/>
+          <w:color w:val="1E293B"/>
+          <w:sz w:val="21"/>
+          <w:szCs w:val="21"/>
+        </w:rPr>
+        <w:t xml:space="preserve">——該規範本身並非獨立煉鋼材質，其允許使用的鋼板材料多為既有的 </w:t>
+      </w:r>
+      <w:r>
+        <w:rPr>
+          <w:rFonts w:ascii="Calibri" w:hAnsi="Calibri" w:eastAsia="Microsoft JhengHei" w:cs="Calibri"/>
+          <w:b/>
+          <w:bCs/>
+          <w:color w:val="1E293B"/>
+          <w:sz w:val="21"/>
+          <w:szCs w:val="21"/>
+        </w:rPr>
+        <w:t xml:space="preserve">ASTM 規格</w:t>
+      </w:r>
+      <w:r>
+        <w:rPr>
+          <w:rFonts w:ascii="Calibri" w:hAnsi="Calibri" w:eastAsia="Microsoft JhengHei" w:cs="Calibri"/>
+          <w:color w:val="1E293B"/>
+          <w:sz w:val="21"/>
+          <w:szCs w:val="21"/>
+        </w:rPr>
+        <w:t xml:space="preserve">（如 ASTM A36、A516 等）或加拿大 CSA G40.21 規格（如 38W/44W），客戶只是希望在 MTR 上加註該批 ASTM A36 / CSA 44W 鋼板符合 API 650 Class 3 之材料要求。</w:t>
       </w:r>
     </w:p>
     <w:p>

</xml_diff>

<commit_message>
Keep only API 650 description in Price Steel meeting records
</commit_message>
<xml_diff>
--- a/20261021_0909_price_steel/20261021_0909_Price_Steel_Audio_Report.docx
+++ b/20261021_0909_price_steel/20261021_0909_Price_Steel_Audio_Report.docx
@@ -543,7 +543,7 @@
           <w:sz w:val="21"/>
           <w:szCs w:val="21"/>
         </w:rPr>
-        <w:t xml:space="preserve">規範本質釐清（API 650 施工規範 vs. API X65 管線鋼）</w:t>
+        <w:t xml:space="preserve">規範本質說明（API 650 儲槽施工規範與 ASTM 材料規格）</w:t>
       </w:r>
       <w:r>
         <w:rPr>
@@ -552,7 +552,7 @@
           <w:sz w:val="21"/>
           <w:szCs w:val="21"/>
         </w:rPr>
-        <w:t xml:space="preserve">：會中我方初期一度誤以為客戶詢問的是 </w:t>
+        <w:t xml:space="preserve">：</w:t>
       </w:r>
       <w:r>
         <w:rPr>
@@ -563,7 +563,7 @@
           <w:sz w:val="21"/>
           <w:szCs w:val="21"/>
         </w:rPr>
-        <w:t xml:space="preserve">API 5L X65</w:t>
+        <w:t xml:space="preserve">API 650 為常壓儲油槽之「施工建造規範（Construction / Fabrication Standard）」，其規範內允許使用的鋼板材料多為既有的 ASTM 規格（如 ASTM A36、A516 等）或加拿大 CSA G40.21 規格（38W / 44W）</w:t>
       </w:r>
       <w:r>
         <w:rPr>
@@ -572,27 +572,7 @@
           <w:sz w:val="21"/>
           <w:szCs w:val="21"/>
         </w:rPr>
-        <w:t xml:space="preserve"> 管線鋼材料，後經現場釐清：</w:t>
-      </w:r>
-      <w:r>
-        <w:rPr>
-          <w:rFonts w:ascii="Calibri" w:hAnsi="Calibri" w:eastAsia="Microsoft JhengHei" w:cs="Calibri"/>
-          <w:b/>
-          <w:bCs/>
-          <w:color w:val="334155"/>
-          <w:sz w:val="21"/>
-          <w:szCs w:val="21"/>
-        </w:rPr>
-        <w:t xml:space="preserve">API 650 實為常壓儲油槽之「施工建造規範（Construction / Fabrication Standard）」，其規範內允許使用的鋼板材料多為既有的 ASTM 規格（如 ASTM A36、A516 等）或加拿大 CSA G40.21 規格（38W / 44W）</w:t>
-      </w:r>
-      <w:r>
-        <w:rPr>
-          <w:rFonts w:ascii="Calibri" w:hAnsi="Calibri" w:eastAsia="Microsoft JhengHei" w:cs="Calibri"/>
-          <w:color w:val="334155"/>
-          <w:sz w:val="21"/>
-          <w:szCs w:val="21"/>
-        </w:rPr>
-        <w:t xml:space="preserve">，而非全新的煉鋼材料規格。</w:t>
+        <w:t xml:space="preserve">，而非獨立的煉鋼材料規格。</w:t>
       </w:r>
     </w:p>
     <w:p>
@@ -2999,7 +2979,7 @@
           <w:sz w:val="21"/>
           <w:szCs w:val="21"/>
         </w:rPr>
-        <w:t xml:space="preserve">Delphic 的回應與規範本質釐清（API X65 管線鋼 vs. API 650 儲槽施工規範）</w:t>
+        <w:t xml:space="preserve">API 650 儲槽施工規範與材料要求說明</w:t>
       </w:r>
       <w:r>
         <w:rPr>
@@ -3023,62 +3003,7 @@
           <w:sz w:val="21"/>
           <w:szCs w:val="21"/>
         </w:rPr>
-        <w:t xml:space="preserve">• Delphic 當下誤以為客戶詢問的是 API 管線鋼，表示記得中鋼曾開發過 </w:t>
-      </w:r>
-      <w:r>
-        <w:rPr>
-          <w:rFonts w:ascii="Calibri" w:hAnsi="Calibri" w:eastAsia="Microsoft JhengHei" w:cs="Calibri"/>
-          <w:b/>
-          <w:bCs/>
-          <w:color w:val="1E293B"/>
-          <w:sz w:val="21"/>
-          <w:szCs w:val="21"/>
-        </w:rPr>
-        <w:t xml:space="preserve">API X65</w:t>
-      </w:r>
-      <w:r>
-        <w:rPr>
-          <w:rFonts w:ascii="Calibri" w:hAnsi="Calibri" w:eastAsia="Microsoft JhengHei" w:cs="Calibri"/>
-          <w:color w:val="1E293B"/>
-          <w:sz w:val="21"/>
-          <w:szCs w:val="21"/>
-        </w:rPr>
-        <w:t xml:space="preserve">（API 5L 管線鋼）。</w:t>
-      </w:r>
-    </w:p>
-    <w:p>
-      <w:pPr>
-        <w:spacing w:before="40" w:after="60" w:line="320" w:lineRule="auto"/>
-        <w:ind w:left="660"/>
-      </w:pPr>
-      <w:r>
-        <w:rPr>
-          <w:rFonts w:ascii="Calibri" w:hAnsi="Calibri" w:eastAsia="Microsoft JhengHei" w:cs="Calibri"/>
-          <w:color w:val="1E293B"/>
-          <w:sz w:val="21"/>
-          <w:szCs w:val="21"/>
-        </w:rPr>
-        <w:t xml:space="preserve">• Phillip 與 Price Steel 立即澄清：</w:t>
-      </w:r>
-      <w:r>
-        <w:rPr>
-          <w:rFonts w:ascii="Calibri" w:hAnsi="Calibri" w:eastAsia="Microsoft JhengHei" w:cs="Calibri"/>
-          <w:b/>
-          <w:bCs/>
-          <w:color w:val="1E293B"/>
-          <w:sz w:val="21"/>
-          <w:szCs w:val="21"/>
-        </w:rPr>
-        <w:t xml:space="preserve">這完全不同（"No, no, this is different."）</w:t>
-      </w:r>
-      <w:r>
-        <w:rPr>
-          <w:rFonts w:ascii="Calibri" w:hAnsi="Calibri" w:eastAsia="Microsoft JhengHei" w:cs="Calibri"/>
-          <w:color w:val="1E293B"/>
-          <w:sz w:val="21"/>
-          <w:szCs w:val="21"/>
-        </w:rPr>
-        <w:t xml:space="preserve">，API X65 是製管用鋼（pipe grade），而 </w:t>
+        <w:t xml:space="preserve">• Phillip 與 Price Steel 說明：</w:t>
       </w:r>
       <w:r>
         <w:rPr>
@@ -3118,7 +3043,7 @@
           <w:sz w:val="21"/>
           <w:szCs w:val="21"/>
         </w:rPr>
-        <w:t xml:space="preserve">（如 ASTM A36、A516 等）或加拿大 CSA G40.21 規格（如 38W/44W），客戶只是希望在 MTR 上加註該批 ASTM A36 / CSA 44W 鋼板符合 API 650 Class 3 之材料要求。</w:t>
+        <w:t xml:space="preserve">（如 ASTM A36、A516 等）或加拿大 CSA G40.21 規格（如 38W/44W），客戶希望在 MTR 上加註該批 ASTM A36 / CSA 44W 鋼板符合 API 650 Class 3 之材料要求。</w:t>
       </w:r>
     </w:p>
     <w:p>

</xml_diff>